<commit_message>
Fix six citation errors and add missing DOI from peer-review audit
- Three quotes mis-cited as Krumholz 398 corrected to 399 (schoolteacher
  ledger quote, "knowing when to stop" quote, "no bad luck" quote),
  confirmed against the source PDF's own page-footer markers.
- Koolish MPD/dissociation quote corrected from "169-70" to "170"
  (falls entirely on 170).
- Koolish Denver-deafness quote corrected from "169" to "169-70"
  (actually spans the page break).
- Bodwin's-father quote citation tightened from "397-98" to "398"
  in sources.md.
- Added the DOI (10.17507/tpls.1512.10) to the Lakshmi et al. Works
  Cited entry in article.md; it was already on file in sources.md but
  had not been carried into the article.
- Regenerated article.docx from the corrected article.md.

Co-Authored-By: Claude Sonnet 5 <noreply@anthropic.com>
</commit_message>
<xml_diff>
--- a/articles/trauma-memory-beloved/article.docx
+++ b/articles/trauma-memory-beloved/article.docx
@@ -690,41 +690,41 @@
           <w:sz w:val="24"/>
           <w:szCs w:val="24"/>
         </w:rPr>
-        <w:t xml:space="preserve">Schoolteacher, who takes over Sweet Home after the death of its more "benevolent" owner, teaches by ledger. Krumholz records the scene in which Sethe overhears him instructing his nephew, and it is as chilling in miniature as anything in the novel: "I told you to put her human characteristics on the left; her animal ones on the right. And don't forget to line them up" (qtd. in Krumholz 398). Note what that sentence is actually doing. It isn't cruelty as impulse or rage — it's cruelty as method, dressed in the language of objectivity, columns and totals standing in for a verdict about what Sethe is. Krumholz is right that this is where Sethe's understanding of her own status as property becomes fully, unbearably concrete; it is one thing to be enslaved, another to watch someone take notes on which parts of you count as human.</w:t>
-      </w:r>
-    </w:p>
-    <w:p>
-      <w:pPr>
-        <w:spacing w:line="480" w:lineRule="auto"/>
-      </w:pPr>
-      <w:r>
-        <w:rPr>
-          <w:rFonts w:ascii="Times New Roman" w:cs="Times New Roman" w:eastAsia="Times New Roman" w:hAnsi="Times New Roman"/>
-          <w:b w:val="false"/>
-          <w:bCs w:val="false"/>
-          <w:i w:val="false"/>
-          <w:iCs w:val="false"/>
-          <w:sz w:val="24"/>
-          <w:szCs w:val="24"/>
-        </w:rPr>
-        <w:t xml:space="preserve">Set that scene against Baby Suggs, who represents, in Sethe's world, the only sustained alternative to that kind of accounting. Baby Suggs preaches in the Clearing without doctrine, without a rulebook, and Krumholz quotes the substance of that preaching directly: "She did not tell them to clean up their lives or to go and sin no more. She did not tell them they were the blessed of the earth, its inheriting meek or its glory bound pure. She told them that the only grace they could have was the grace they could imagine. That if they could not see it, they would not have it" (qtd. in Krumholz 398). That is about as far from schoolteacher's ledger as a moral system can get: no fixed categories, no external judgment, nothing to line up in columns. Baby Suggs's own account of ethics is even more compressed and, I'd argue, more radical than the sermon suggests: "'Everything depends on knowing how much,' she said, and 'Good is knowing when to stop'" (qtd. in Krumholz 398). Goodness, on this account, isn't a fixed quality you either have or lack. It's a form of restraint you have to keep exercising, over and over, with judgment rather than a rule to fall back on — which is exactly the capacity schoolteacher's whole pedagogy is designed to eliminate.</w:t>
-      </w:r>
-    </w:p>
-    <w:p>
-      <w:pPr>
-        <w:spacing w:line="480" w:lineRule="auto"/>
-      </w:pPr>
-      <w:r>
-        <w:rPr>
-          <w:rFonts w:ascii="Times New Roman" w:cs="Times New Roman" w:eastAsia="Times New Roman" w:hAnsi="Times New Roman"/>
-          <w:b w:val="false"/>
-          <w:bCs w:val="false"/>
-          <w:i w:val="false"/>
-          <w:iCs w:val="false"/>
-          <w:sz w:val="24"/>
-          <w:szCs w:val="24"/>
-        </w:rPr>
-        <w:t xml:space="preserve">Lakshmi and her co-authors extend this same opposition into the novel's use of sound, noting that "Baby Suggs encourages people to 'love your hands' and appreciate their bodies (Morrison, 1987, pp. 103–104)" as part of what they call "sonic resistance" — public "singing and testimonies" in the Clearing that give "formerly enslaved people a feeling of community and value" (qtd. in Lakshmi K et al. 3913). Read next to schoolteacher's ledger, "love your hands" stops sounding like generic uplift and starts sounding like a direct, targeted counter-claim: your hands are not items on someone else's inventory. Baby Suggs eventually gives up preaching and, as Krumholz notes, comes to a harsher conclusion about the people who built the ledger system in the first place — that "there was no bad luck in the world but white people. 'They don't know when to stop,' she said" (qtd. in Krumholz 398). It's the same moral vocabulary — knowing when to stop — turned from a personal ethic into an indictment. The tragedy of the novel, on this reading, is not only that Sethe was traumatized. It's that she was made to live inside schoolteacher's accounting system for long enough that killing her daughter looked, to her, like the only way to keep that daughter out of the ledger.</w:t>
+        <w:t xml:space="preserve">Schoolteacher, who takes over Sweet Home after the death of its more "benevolent" owner, teaches by ledger. Krumholz records the scene in which Sethe overhears him instructing his nephew, and it is as chilling in miniature as anything in the novel: "I told you to put her human characteristics on the left; her animal ones on the right. And don't forget to line them up" (qtd. in Krumholz 399). Note what that sentence is actually doing. It isn't cruelty as impulse or rage — it's cruelty as method, dressed in the language of objectivity, columns and totals standing in for a verdict about what Sethe is. Krumholz is right that this is where Sethe's understanding of her own status as property becomes fully, unbearably concrete; it is one thing to be enslaved, another to watch someone take notes on which parts of you count as human.</w:t>
+      </w:r>
+    </w:p>
+    <w:p>
+      <w:pPr>
+        <w:spacing w:line="480" w:lineRule="auto"/>
+      </w:pPr>
+      <w:r>
+        <w:rPr>
+          <w:rFonts w:ascii="Times New Roman" w:cs="Times New Roman" w:eastAsia="Times New Roman" w:hAnsi="Times New Roman"/>
+          <w:b w:val="false"/>
+          <w:bCs w:val="false"/>
+          <w:i w:val="false"/>
+          <w:iCs w:val="false"/>
+          <w:sz w:val="24"/>
+          <w:szCs w:val="24"/>
+        </w:rPr>
+        <w:t xml:space="preserve">Set that scene against Baby Suggs, who represents, in Sethe's world, the only sustained alternative to that kind of accounting. Baby Suggs preaches in the Clearing without doctrine, without a rulebook, and Krumholz quotes the substance of that preaching directly: "She did not tell them to clean up their lives or to go and sin no more. She did not tell them they were the blessed of the earth, its inheriting meek or its glory bound pure. She told them that the only grace they could have was the grace they could imagine. That if they could not see it, they would not have it" (qtd. in Krumholz 398). That is about as far from schoolteacher's ledger as a moral system can get: no fixed categories, no external judgment, nothing to line up in columns. Baby Suggs's own account of ethics is even more compressed and, I'd argue, more radical than the sermon suggests: "'Everything depends on knowing how much,' she said, and 'Good is knowing when to stop'" (qtd. in Krumholz 399). Goodness, on this account, isn't a fixed quality you either have or lack. It's a form of restraint you have to keep exercising, over and over, with judgment rather than a rule to fall back on — which is exactly the capacity schoolteacher's whole pedagogy is designed to eliminate.</w:t>
+      </w:r>
+    </w:p>
+    <w:p>
+      <w:pPr>
+        <w:spacing w:line="480" w:lineRule="auto"/>
+      </w:pPr>
+      <w:r>
+        <w:rPr>
+          <w:rFonts w:ascii="Times New Roman" w:cs="Times New Roman" w:eastAsia="Times New Roman" w:hAnsi="Times New Roman"/>
+          <w:b w:val="false"/>
+          <w:bCs w:val="false"/>
+          <w:i w:val="false"/>
+          <w:iCs w:val="false"/>
+          <w:sz w:val="24"/>
+          <w:szCs w:val="24"/>
+        </w:rPr>
+        <w:t xml:space="preserve">Lakshmi and her co-authors extend this same opposition into the novel's use of sound, noting that "Baby Suggs encourages people to 'love your hands' and appreciate their bodies (Morrison, 1987, pp. 103–104)" as part of what they call "sonic resistance" — public "singing and testimonies" in the Clearing that give "formerly enslaved people a feeling of community and value" (qtd. in Lakshmi K et al. 3913). Read next to schoolteacher's ledger, "love your hands" stops sounding like generic uplift and starts sounding like a direct, targeted counter-claim: your hands are not items on someone else's inventory. Baby Suggs eventually gives up preaching and, as Krumholz notes, comes to a harsher conclusion about the people who built the ledger system in the first place — that "there was no bad luck in the world but white people. 'They don't know when to stop,' she said" (qtd. in Krumholz 399). It's the same moral vocabulary — knowing when to stop — turned from a personal ethic into an indictment. The tragedy of the novel, on this reading, is not only that Sethe was traumatized. It's that she was made to live inside schoolteacher's accounting system for long enough that killing her daughter looked, to her, like the only way to keep that daughter out of the ledger.</w:t>
       </w:r>
     </w:p>
     <w:p>
@@ -798,24 +798,24 @@
           <w:sz w:val="24"/>
           <w:szCs w:val="24"/>
         </w:rPr>
-        <w:t xml:space="preserve">What's striking about Koolish's argument is how insistently she refuses to let this be a story about one traumatized woman. She reads the entire household — Sethe, Denver, Paul D, and Beloved herself — as caught in something closer to a shared disorder than an individual wound, arguing that their "consciousness … [is] suffused with a truncated, relentless, disrupted chronology common to persons so severely abused that they suffer from Multiple Personality Disorder (MPD) or dissociative states" (169–70). That reframes a lot of what looks, on a first read, like Gothic excess — the ghost, the ageless newcomer, the fractured chronology — as clinically legible instead. Baby Suggs, worn down by the deaths and disappearances of eight children, is left, in Morrison's phrase as Koolish quotes it, with "a 'sadness . . . at her center, the desolated center where the self that was no self made its home'" (qtd. in Koolish 169, citing Morrison 140). That's not simply grief. It's a description of a self that has been hollowed out from continuous loss until there's a vacancy where a person used to be.</w:t>
-      </w:r>
-    </w:p>
-    <w:p>
-      <w:pPr>
-        <w:spacing w:line="480" w:lineRule="auto"/>
-      </w:pPr>
-      <w:r>
-        <w:rPr>
-          <w:rFonts w:ascii="Times New Roman" w:cs="Times New Roman" w:eastAsia="Times New Roman" w:hAnsi="Times New Roman"/>
-          <w:b w:val="false"/>
-          <w:bCs w:val="false"/>
-          <w:i w:val="false"/>
-          <w:iCs w:val="false"/>
-          <w:sz w:val="24"/>
-          <w:szCs w:val="24"/>
-        </w:rPr>
-        <w:t xml:space="preserve">Denver's version of the same damage is quieter and, in a way, sadder: once she learns the full truth of what happened to her sister, she goes functionally deaf, and explains it herself in a line Koolish singles out: "Made me have to read faces and learn how to figure out what people were thinking, so I didn't need to hear what they said" (qtd. in Koolish 169, citing Morrison 206). Koolish's essay insists that recovery from this state requires characters to stop protecting themselves through exactly this kind of self-imposed blindness and deafness — that healing "requires access to painful memories," and the novel's characters only "reintegrate, achieve 'the join' … when they no longer refuse the deepest knowledge of the meanings of their individual and historical pasts" (169). Put this next to Krumholz's account of rememory and a harder truth emerges: knowing where the past lives, as a fact about the world, is not the same as being able to survive going there. The historical claim and the psychological cost are two separate problems, and </w:t>
+        <w:t xml:space="preserve">What's striking about Koolish's argument is how insistently she refuses to let this be a story about one traumatized woman. She reads the entire household — Sethe, Denver, Paul D, and Beloved herself — as caught in something closer to a shared disorder than an individual wound, arguing that their "consciousness … [is] suffused with a truncated, relentless, disrupted chronology common to persons so severely abused that they suffer from Multiple Personality Disorder (MPD) or dissociative states" (170). That reframes a lot of what looks, on a first read, like Gothic excess — the ghost, the ageless newcomer, the fractured chronology — as clinically legible instead. Baby Suggs, worn down by the deaths and disappearances of eight children, is left, in Morrison's phrase as Koolish quotes it, with "a 'sadness . . . at her center, the desolated center where the self that was no self made its home'" (qtd. in Koolish 169, citing Morrison 140). That's not simply grief. It's a description of a self that has been hollowed out from continuous loss until there's a vacancy where a person used to be.</w:t>
+      </w:r>
+    </w:p>
+    <w:p>
+      <w:pPr>
+        <w:spacing w:line="480" w:lineRule="auto"/>
+      </w:pPr>
+      <w:r>
+        <w:rPr>
+          <w:rFonts w:ascii="Times New Roman" w:cs="Times New Roman" w:eastAsia="Times New Roman" w:hAnsi="Times New Roman"/>
+          <w:b w:val="false"/>
+          <w:bCs w:val="false"/>
+          <w:i w:val="false"/>
+          <w:iCs w:val="false"/>
+          <w:sz w:val="24"/>
+          <w:szCs w:val="24"/>
+        </w:rPr>
+        <w:t xml:space="preserve">Denver's version of the same damage is quieter and, in a way, sadder: once she learns the full truth of what happened to her sister, she goes functionally deaf, and explains it herself in a line Koolish singles out: "Made me have to read faces and learn how to figure out what people were thinking, so I didn't need to hear what they said" (qtd. in Koolish, pp. 169–70, citing Morrison 206). Koolish's essay insists that recovery from this state requires characters to stop protecting themselves through exactly this kind of self-imposed blindness and deafness — that healing "requires access to painful memories," and the novel's characters only "reintegrate, achieve 'the join' … when they no longer refuse the deepest knowledge of the meanings of their individual and historical pasts" (169). Put this next to Krumholz's account of rememory and a harder truth emerges: knowing where the past lives, as a fact about the world, is not the same as being able to survive going there. The historical claim and the psychological cost are two separate problems, and </w:t>
       </w:r>
       <w:r>
         <w:rPr>
@@ -1215,7 +1215,7 @@
           <w:sz w:val="24"/>
           <w:szCs w:val="24"/>
         </w:rPr>
-        <w:t xml:space="preserve">, vol. 15, no. 12, 2025, pp. 3910–3919.</w:t>
+        <w:t xml:space="preserve">, vol. 15, no. 12, 2025, pp. 3910–3919, doi:10.17507/tpls.1512.10.</w:t>
       </w:r>
     </w:p>
     <w:p>

</xml_diff>